<commit_message>
Add netlify functions and update documento.docx
Co-Authored-By: Claude Sonnet 4.6 <noreply@anthropic.com>
</commit_message>
<xml_diff>
--- a/documento.docx
+++ b/documento.docx
@@ -4,18 +4,60 @@
   <w:body>
     <w:p>
       <w:r>
-        <w:t>mattdesigns66886480M!m51216360</w:t>
+        <w:t>mattdesigns66886480</w:t>
+      </w:r>
+      <w:proofErr w:type="gramStart"/>
+      <w:r>
+        <w:t>M!m</w:t>
+      </w:r>
+      <w:proofErr w:type="gramEnd"/>
+      <w:r>
+        <w:t>51216360</w:t>
       </w:r>
     </w:p>
     <w:p>
+      <w:pPr>
+        <w:rPr>
+          <w:lang w:val="es-AR"/>
+        </w:rPr>
+      </w:pPr>
       <w:r>
+        <w:rPr>
+          <w:lang w:val="es-AR"/>
+        </w:rPr>
         <w:t>2ryGn4Q.vE$ujug</w:t>
       </w:r>
       <w:r>
-        <w:t xml:space="preserve">         -            Formspree</w:t>
+        <w:rPr>
+          <w:lang w:val="es-AR"/>
+        </w:rPr>
+        <w:t xml:space="preserve"> </w:t>
+      </w:r>
+      <w:proofErr w:type="spellStart"/>
+      <w:r>
+        <w:rPr>
+          <w:lang w:val="es-AR"/>
+        </w:rPr>
+        <w:t>Formspree</w:t>
+      </w:r>
+      <w:proofErr w:type="spellEnd"/>
+      <w:r>
+        <w:rPr>
+          <w:lang w:val="es-AR"/>
+        </w:rPr>
+        <w:t xml:space="preserve"> y Brevo</w:t>
       </w:r>
       <w:r>
-        <w:t xml:space="preserve"> y Brevo</w:t>
+        <w:rPr>
+          <w:lang w:val="es-AR"/>
+        </w:rPr>
+        <w:t xml:space="preserve"> y</w:t>
+      </w:r>
+      <w:r>
+        <w:rPr>
+          <w:lang w:val="es-AR"/>
+        </w:rPr>
+        <w:t xml:space="preserve"> Decap</w:t>
       </w:r>
     </w:p>
     <w:sectPr>

</xml_diff>